<commit_message>
add forcast to slides
</commit_message>
<xml_diff>
--- a/Documentation/Weekly Report/week8/CMSC-4920-Week8Report-Group2.docx
+++ b/Documentation/Weekly Report/week8/CMSC-4920-Week8Report-Group2.docx
@@ -1673,7 +1673,21 @@
         <w:rPr>
           <w:rFonts w:ascii="Times New Roman" w:hAnsi="Times New Roman" w:cs="Times New Roman"/>
         </w:rPr>
-        <w:t xml:space="preserve"> development of both the challenges and teams page</w:t>
+        <w:t xml:space="preserve"> development of both the challenges and </w:t>
+      </w:r>
+      <w:proofErr w:type="gramStart"/>
+      <w:r>
+        <w:rPr>
+          <w:rFonts w:ascii="Times New Roman" w:hAnsi="Times New Roman" w:cs="Times New Roman"/>
+        </w:rPr>
+        <w:t>teams</w:t>
+      </w:r>
+      <w:proofErr w:type="gramEnd"/>
+      <w:r>
+        <w:rPr>
+          <w:rFonts w:ascii="Times New Roman" w:hAnsi="Times New Roman" w:cs="Times New Roman"/>
+        </w:rPr>
+        <w:t xml:space="preserve"> page</w:t>
       </w:r>
       <w:r>
         <w:rPr>
@@ -1786,13 +1800,27 @@
           <w:rFonts w:ascii="Times New Roman" w:hAnsi="Times New Roman" w:cs="Times New Roman"/>
         </w:rPr>
         <w:tab/>
-        <w:t>The first goal accom</w:t>
-      </w:r>
-      <w:r>
-        <w:rPr>
-          <w:rFonts w:ascii="Times New Roman" w:hAnsi="Times New Roman" w:cs="Times New Roman"/>
-        </w:rPr>
-        <w:t xml:space="preserve">plished was implementing a </w:t>
+        <w:t xml:space="preserve">The first </w:t>
+      </w:r>
+      <w:proofErr w:type="gramStart"/>
+      <w:r>
+        <w:rPr>
+          <w:rFonts w:ascii="Times New Roman" w:hAnsi="Times New Roman" w:cs="Times New Roman"/>
+        </w:rPr>
+        <w:t>goal accom</w:t>
+      </w:r>
+      <w:r>
+        <w:rPr>
+          <w:rFonts w:ascii="Times New Roman" w:hAnsi="Times New Roman" w:cs="Times New Roman"/>
+        </w:rPr>
+        <w:t>plished</w:t>
+      </w:r>
+      <w:proofErr w:type="gramEnd"/>
+      <w:r>
+        <w:rPr>
+          <w:rFonts w:ascii="Times New Roman" w:hAnsi="Times New Roman" w:cs="Times New Roman"/>
+        </w:rPr>
+        <w:t xml:space="preserve"> was implementing a </w:t>
       </w:r>
       <w:r>
         <w:rPr>
@@ -1828,7 +1856,21 @@
         <w:rPr>
           <w:rFonts w:ascii="Times New Roman" w:hAnsi="Times New Roman" w:cs="Times New Roman"/>
         </w:rPr>
-        <w:t xml:space="preserve">This section simply shows two buttons at the moment, which are buttons to delete the account and change the username. The next steps are to format the page to be more </w:t>
+        <w:t xml:space="preserve">This section simply shows two buttons </w:t>
+      </w:r>
+      <w:proofErr w:type="gramStart"/>
+      <w:r>
+        <w:rPr>
+          <w:rFonts w:ascii="Times New Roman" w:hAnsi="Times New Roman" w:cs="Times New Roman"/>
+        </w:rPr>
+        <w:t>at the moment</w:t>
+      </w:r>
+      <w:proofErr w:type="gramEnd"/>
+      <w:r>
+        <w:rPr>
+          <w:rFonts w:ascii="Times New Roman" w:hAnsi="Times New Roman" w:cs="Times New Roman"/>
+        </w:rPr>
+        <w:t xml:space="preserve">, which are buttons to delete the account and change the username. The next steps are to format the page to be more </w:t>
       </w:r>
       <w:r>
         <w:rPr>
@@ -2070,7 +2112,21 @@
         <w:rPr>
           <w:rFonts w:ascii="Times New Roman" w:hAnsi="Times New Roman" w:cs="Times New Roman"/>
         </w:rPr>
-        <w:t xml:space="preserve">was the delete account feature, which would not work until we cleared all foreign key references </w:t>
+        <w:t xml:space="preserve">was the </w:t>
+      </w:r>
+      <w:proofErr w:type="gramStart"/>
+      <w:r>
+        <w:rPr>
+          <w:rFonts w:ascii="Times New Roman" w:hAnsi="Times New Roman" w:cs="Times New Roman"/>
+        </w:rPr>
+        <w:t>delete</w:t>
+      </w:r>
+      <w:proofErr w:type="gramEnd"/>
+      <w:r>
+        <w:rPr>
+          <w:rFonts w:ascii="Times New Roman" w:hAnsi="Times New Roman" w:cs="Times New Roman"/>
+        </w:rPr>
+        <w:t xml:space="preserve"> account feature, which would not work until we cleared all foreign key references </w:t>
       </w:r>
       <w:r>
         <w:rPr>
@@ -2156,7 +2212,14 @@
         <w:rPr>
           <w:rFonts w:ascii="Times New Roman" w:hAnsi="Times New Roman" w:cs="Times New Roman"/>
         </w:rPr>
-        <w:t xml:space="preserve">This application gives us 100 free emails per day in the trial plan, which does not require us to verify our domain. This could cause issues in the future if we have a large </w:t>
+        <w:t xml:space="preserve">This application gives us 100 free emails per day in the trial plan, which does not require us to verify our domain. This could cause issues in the future if we have </w:t>
+      </w:r>
+      <w:proofErr w:type="gramStart"/>
+      <w:r>
+        <w:rPr>
+          <w:rFonts w:ascii="Times New Roman" w:hAnsi="Times New Roman" w:cs="Times New Roman"/>
+        </w:rPr>
+        <w:t xml:space="preserve">a large </w:t>
       </w:r>
       <w:r>
         <w:rPr>
@@ -2168,7 +2231,14 @@
         <w:rPr>
           <w:rFonts w:ascii="Times New Roman" w:hAnsi="Times New Roman" w:cs="Times New Roman"/>
         </w:rPr>
-        <w:t xml:space="preserve"> of users, but for testing purposes</w:t>
+        <w:t xml:space="preserve"> of</w:t>
+      </w:r>
+      <w:proofErr w:type="gramEnd"/>
+      <w:r>
+        <w:rPr>
+          <w:rFonts w:ascii="Times New Roman" w:hAnsi="Times New Roman" w:cs="Times New Roman"/>
+        </w:rPr>
+        <w:t xml:space="preserve"> users, but for testing purposes</w:t>
       </w:r>
       <w:r>
         <w:rPr>
@@ -2186,7 +2256,37 @@
         <w:rPr>
           <w:rFonts w:ascii="Times New Roman" w:hAnsi="Times New Roman" w:cs="Times New Roman"/>
         </w:rPr>
-        <w:t>fit the dashboard API into our code in order to send an email with that key instead of the Resend key we attempted to use before hand.</w:t>
+        <w:t xml:space="preserve">fit the dashboard API into our code </w:t>
+      </w:r>
+      <w:proofErr w:type="gramStart"/>
+      <w:r>
+        <w:rPr>
+          <w:rFonts w:ascii="Times New Roman" w:hAnsi="Times New Roman" w:cs="Times New Roman"/>
+        </w:rPr>
+        <w:t>in order to</w:t>
+      </w:r>
+      <w:proofErr w:type="gramEnd"/>
+      <w:r>
+        <w:rPr>
+          <w:rFonts w:ascii="Times New Roman" w:hAnsi="Times New Roman" w:cs="Times New Roman"/>
+        </w:rPr>
+        <w:t xml:space="preserve"> send an email with that key instead of the Resend key we attempted to use </w:t>
+      </w:r>
+      <w:proofErr w:type="spellStart"/>
+      <w:proofErr w:type="gramStart"/>
+      <w:r>
+        <w:rPr>
+          <w:rFonts w:ascii="Times New Roman" w:hAnsi="Times New Roman" w:cs="Times New Roman"/>
+        </w:rPr>
+        <w:t>before hand</w:t>
+      </w:r>
+      <w:proofErr w:type="spellEnd"/>
+      <w:proofErr w:type="gramEnd"/>
+      <w:r>
+        <w:rPr>
+          <w:rFonts w:ascii="Times New Roman" w:hAnsi="Times New Roman" w:cs="Times New Roman"/>
+        </w:rPr>
+        <w:t>.</w:t>
       </w:r>
     </w:p>
     <w:p>
@@ -2332,7 +2432,21 @@
         <w:rPr>
           <w:rFonts w:ascii="Times New Roman" w:hAnsi="Times New Roman" w:cs="Times New Roman"/>
         </w:rPr>
-        <w:t>s including activity tracking, leaderboard, clubs and challenges. The feedback from the test group was documented and compiled in a user feedback file that our whole team has access to. We believe although we are still months away from our tracker being a finished product, user testing is an extremely important and valuable process. This is because getting users without biases or technical knowledge to run through a program exposes issues the developers might not have previously considered. For example, one test user suggested a feature that has the users confirm the password they chose while making an account, a simple feature used is many applications to ensure the user didn’t accidentally mess up their wanted password, but for us developers who just want to log on to the application as fast as we can to test other features, we never thought of it.</w:t>
+        <w:t xml:space="preserve">s including activity tracking, leaderboard, clubs and challenges. The feedback from the test group was documented and compiled in a user feedback file that our whole team has access to. We believe although we are still months away from our tracker being a finished product, user testing is an extremely important and valuable process. This is because getting users without biases or technical knowledge to run through a program exposes </w:t>
+      </w:r>
+      <w:proofErr w:type="gramStart"/>
+      <w:r>
+        <w:rPr>
+          <w:rFonts w:ascii="Times New Roman" w:hAnsi="Times New Roman" w:cs="Times New Roman"/>
+        </w:rPr>
+        <w:t>issues</w:t>
+      </w:r>
+      <w:proofErr w:type="gramEnd"/>
+      <w:r>
+        <w:rPr>
+          <w:rFonts w:ascii="Times New Roman" w:hAnsi="Times New Roman" w:cs="Times New Roman"/>
+        </w:rPr>
+        <w:t xml:space="preserve"> the developers might not have previously considered. For example, one test user suggested a feature that has the users confirm the password they chose while making an account, a simple feature used is many applications to ensure the user didn’t accidentally mess up their wanted password, but for us developers who just want to log on to the application as fast as we can to test other features, we never thought of it.</w:t>
       </w:r>
     </w:p>
     <w:p>
@@ -2369,7 +2483,21 @@
         <w:rPr>
           <w:rFonts w:ascii="Times New Roman" w:hAnsi="Times New Roman" w:cs="Times New Roman"/>
         </w:rPr>
-        <w:t xml:space="preserve">The last accomplishment of this week was the continued development of both our challenges and teams pages. The development of both is moving at a slow but steady pace as we are trying to link the activity data and the frontend to present </w:t>
+        <w:t xml:space="preserve">The last accomplishment of this week was the continued development of both our challenges and </w:t>
+      </w:r>
+      <w:proofErr w:type="gramStart"/>
+      <w:r>
+        <w:rPr>
+          <w:rFonts w:ascii="Times New Roman" w:hAnsi="Times New Roman" w:cs="Times New Roman"/>
+        </w:rPr>
+        <w:t>teams</w:t>
+      </w:r>
+      <w:proofErr w:type="gramEnd"/>
+      <w:r>
+        <w:rPr>
+          <w:rFonts w:ascii="Times New Roman" w:hAnsi="Times New Roman" w:cs="Times New Roman"/>
+        </w:rPr>
+        <w:t xml:space="preserve"> pages. The development of both is moving at a slow but steady pace as we are trying to link the activity data and the frontend to present </w:t>
       </w:r>
       <w:r>
         <w:rPr>
@@ -3111,6 +3239,7 @@
         </w:rPr>
       </w:pPr>
       <w:hyperlink r:id="rId12" w:history="1">
+        <w:proofErr w:type="spellStart"/>
         <w:r>
           <w:rPr>
             <w:rStyle w:val="Hyperlink"/>
@@ -3120,6 +3249,7 @@
           </w:rPr>
           <w:t>Agafonkin</w:t>
         </w:r>
+        <w:proofErr w:type="spellEnd"/>
       </w:hyperlink>
       <w:r>
         <w:rPr>

</xml_diff>

<commit_message>
finish week 8 docs
</commit_message>
<xml_diff>
--- a/Documentation/Weekly Report/week8/CMSC-4920-Week8Report-Group2.docx
+++ b/Documentation/Weekly Report/week8/CMSC-4920-Week8Report-Group2.docx
@@ -1733,6 +1733,12 @@
         <w:rPr>
           <w:rFonts w:ascii="Times New Roman" w:hAnsi="Times New Roman" w:cs="Times New Roman"/>
         </w:rPr>
+        <w:t xml:space="preserve"> and finalization of the dashboard</w:t>
+      </w:r>
+      <w:r>
+        <w:rPr>
+          <w:rFonts w:ascii="Times New Roman" w:hAnsi="Times New Roman" w:cs="Times New Roman"/>
+        </w:rPr>
         <w:t xml:space="preserve">. </w:t>
       </w:r>
       <w:r>
@@ -2010,6 +2016,12 @@
           <w:rFonts w:ascii="Times New Roman" w:hAnsi="Times New Roman" w:cs="Times New Roman"/>
         </w:rPr>
         <w:t>was to get emails to send out, but we ran into a stumbling block when trying to do this</w:t>
+      </w:r>
+      <w:r>
+        <w:rPr>
+          <w:rFonts w:ascii="Times New Roman" w:hAnsi="Times New Roman" w:cs="Times New Roman"/>
+        </w:rPr>
+        <w:t>. Continued research was done to find an email hosting system that would meet our platform needs.</w:t>
       </w:r>
     </w:p>
     <w:p>
@@ -2288,16 +2300,117 @@
         <w:rPr>
           <w:rFonts w:ascii="Times New Roman" w:hAnsi="Times New Roman" w:cs="Times New Roman"/>
         </w:rPr>
-        <w:t xml:space="preserve">fit the dashboard API into our code in order to send an email with that key instead of the Resend key we attempted to use </w:t>
-      </w:r>
-      <w:proofErr w:type="spellStart"/>
-      <w:r>
-        <w:rPr>
-          <w:rFonts w:ascii="Times New Roman" w:hAnsi="Times New Roman" w:cs="Times New Roman"/>
-        </w:rPr>
-        <w:t>before hand</w:t>
-      </w:r>
-      <w:proofErr w:type="spellEnd"/>
+        <w:t xml:space="preserve">fit the dashboard API into our code in order to send an email with that key </w:t>
+      </w:r>
+      <w:r>
+        <w:rPr>
+          <w:rFonts w:ascii="Times New Roman" w:hAnsi="Times New Roman" w:cs="Times New Roman"/>
+        </w:rPr>
+        <w:lastRenderedPageBreak/>
+        <w:t xml:space="preserve">instead of the Resend key we attempted to use </w:t>
+      </w:r>
+      <w:r>
+        <w:rPr>
+          <w:rFonts w:ascii="Times New Roman" w:hAnsi="Times New Roman" w:cs="Times New Roman"/>
+        </w:rPr>
+        <w:t>beforehand</w:t>
+      </w:r>
+      <w:r>
+        <w:rPr>
+          <w:rFonts w:ascii="Times New Roman" w:hAnsi="Times New Roman" w:cs="Times New Roman"/>
+        </w:rPr>
+        <w:t>.</w:t>
+      </w:r>
+      <w:r>
+        <w:rPr>
+          <w:rFonts w:ascii="Times New Roman" w:hAnsi="Times New Roman" w:cs="Times New Roman"/>
+        </w:rPr>
+        <w:t xml:space="preserve"> </w:t>
+      </w:r>
+      <w:r>
+        <w:rPr>
+          <w:rFonts w:ascii="Times New Roman" w:hAnsi="Times New Roman" w:cs="Times New Roman"/>
+        </w:rPr>
+        <w:t>However</w:t>
+      </w:r>
+      <w:r>
+        <w:rPr>
+          <w:rFonts w:ascii="Times New Roman" w:hAnsi="Times New Roman" w:cs="Times New Roman"/>
+        </w:rPr>
+        <w:t>,</w:t>
+      </w:r>
+      <w:r>
+        <w:rPr>
+          <w:rFonts w:ascii="Times New Roman" w:hAnsi="Times New Roman" w:cs="Times New Roman"/>
+        </w:rPr>
+        <w:t xml:space="preserve"> an additional error </w:t>
+      </w:r>
+      <w:r>
+        <w:rPr>
+          <w:rFonts w:ascii="Times New Roman" w:hAnsi="Times New Roman" w:cs="Times New Roman"/>
+        </w:rPr>
+        <w:t>was found.</w:t>
+      </w:r>
+      <w:r>
+        <w:rPr>
+          <w:rFonts w:ascii="Times New Roman" w:hAnsi="Times New Roman" w:cs="Times New Roman"/>
+        </w:rPr>
+        <w:t xml:space="preserve"> </w:t>
+      </w:r>
+      <w:r>
+        <w:rPr>
+          <w:rFonts w:ascii="Times New Roman" w:hAnsi="Times New Roman" w:cs="Times New Roman"/>
+        </w:rPr>
+        <w:t xml:space="preserve">The email </w:t>
+      </w:r>
+      <w:r>
+        <w:rPr>
+          <w:rFonts w:ascii="Times New Roman" w:hAnsi="Times New Roman" w:cs="Times New Roman"/>
+        </w:rPr>
+        <w:t xml:space="preserve">API key only works for the </w:t>
+      </w:r>
+      <w:r>
+        <w:rPr>
+          <w:rFonts w:ascii="Times New Roman" w:hAnsi="Times New Roman" w:cs="Times New Roman"/>
+        </w:rPr>
+        <w:t>user that created the email API account</w:t>
+      </w:r>
+      <w:r>
+        <w:rPr>
+          <w:rFonts w:ascii="Times New Roman" w:hAnsi="Times New Roman" w:cs="Times New Roman"/>
+        </w:rPr>
+        <w:t xml:space="preserve">. This causes our other team members to not be able to use the API. Since the email verification determines login success, without </w:t>
+      </w:r>
+      <w:r>
+        <w:rPr>
+          <w:rFonts w:ascii="Times New Roman" w:hAnsi="Times New Roman" w:cs="Times New Roman"/>
+        </w:rPr>
+        <w:t xml:space="preserve">the code working it blocked team members from entering the platform for development. </w:t>
+      </w:r>
+      <w:r>
+        <w:rPr>
+          <w:rFonts w:ascii="Times New Roman" w:hAnsi="Times New Roman" w:cs="Times New Roman"/>
+        </w:rPr>
+        <w:t>The</w:t>
+      </w:r>
+      <w:r>
+        <w:rPr>
+          <w:rFonts w:ascii="Times New Roman" w:hAnsi="Times New Roman" w:cs="Times New Roman"/>
+        </w:rPr>
+        <w:t xml:space="preserve"> email code was removed from the main working branch and </w:t>
+      </w:r>
+      <w:r>
+        <w:rPr>
+          <w:rFonts w:ascii="Times New Roman" w:hAnsi="Times New Roman" w:cs="Times New Roman"/>
+        </w:rPr>
+        <w:t>saved on a separate branch of code until further development</w:t>
+      </w:r>
+      <w:r>
+        <w:rPr>
+          <w:rFonts w:ascii="Times New Roman" w:hAnsi="Times New Roman" w:cs="Times New Roman"/>
+        </w:rPr>
+        <w:t xml:space="preserve"> and research has been performed</w:t>
+      </w:r>
       <w:r>
         <w:rPr>
           <w:rFonts w:ascii="Times New Roman" w:hAnsi="Times New Roman" w:cs="Times New Roman"/>
@@ -2317,7 +2430,6 @@
         <w:rPr>
           <w:rFonts w:ascii="Times New Roman" w:hAnsi="Times New Roman" w:cs="Times New Roman"/>
         </w:rPr>
-        <w:lastRenderedPageBreak/>
         <w:t xml:space="preserve">2. </w:t>
       </w:r>
       <w:r>
@@ -2423,6 +2535,18 @@
         </w:rPr>
         <w:t xml:space="preserve">According to our Gantt chart our team is still on schedule for many parts of the project. </w:t>
       </w:r>
+      <w:r>
+        <w:rPr>
+          <w:rFonts w:ascii="Times New Roman" w:hAnsi="Times New Roman" w:cs="Times New Roman"/>
+        </w:rPr>
+        <w:t xml:space="preserve">It was very important to our team to leave spring break with thorough development on our senior project platform. </w:t>
+      </w:r>
+      <w:r>
+        <w:rPr>
+          <w:rFonts w:ascii="Times New Roman" w:hAnsi="Times New Roman" w:cs="Times New Roman"/>
+        </w:rPr>
+        <w:t>We feel that we are on track, if not ahead of development progress. Each member provided valuable and crucial development, research, and debugging during this week.</w:t>
+      </w:r>
     </w:p>
     <w:p>
       <w:pPr>
@@ -2447,6 +2571,7 @@
           <w:sz w:val="24"/>
           <w:szCs w:val="24"/>
         </w:rPr>
+        <w:lastRenderedPageBreak/>
         <w:t>Gantt Chart:</w:t>
       </w:r>
       <w:bookmarkEnd w:id="5"/>
@@ -2538,7 +2663,6 @@
           <w:sz w:val="24"/>
           <w:szCs w:val="24"/>
         </w:rPr>
-        <w:lastRenderedPageBreak/>
         <w:t xml:space="preserve">Week </w:t>
       </w:r>
       <w:r>
@@ -2621,6 +2745,54 @@
           <w:rFonts w:ascii="Times New Roman" w:hAnsi="Times New Roman" w:cs="Times New Roman"/>
         </w:rPr>
         <w:t xml:space="preserve">, with some of them still having minor bugs in them. </w:t>
+      </w:r>
+      <w:r>
+        <w:rPr>
+          <w:rFonts w:ascii="Times New Roman" w:hAnsi="Times New Roman" w:cs="Times New Roman"/>
+        </w:rPr>
+        <w:t xml:space="preserve">The final goal of the week will be continuing development on the Teams page. </w:t>
+      </w:r>
+      <w:r>
+        <w:rPr>
+          <w:rFonts w:ascii="Times New Roman" w:hAnsi="Times New Roman" w:cs="Times New Roman"/>
+        </w:rPr>
+        <w:t xml:space="preserve">Continuous checks </w:t>
+      </w:r>
+      <w:r>
+        <w:rPr>
+          <w:rFonts w:ascii="Times New Roman" w:hAnsi="Times New Roman" w:cs="Times New Roman"/>
+        </w:rPr>
+        <w:t xml:space="preserve">also </w:t>
+      </w:r>
+      <w:r>
+        <w:rPr>
+          <w:rFonts w:ascii="Times New Roman" w:hAnsi="Times New Roman" w:cs="Times New Roman"/>
+        </w:rPr>
+        <w:t xml:space="preserve">will be performed to ensure that our project is properly </w:t>
+      </w:r>
+      <w:r>
+        <w:rPr>
+          <w:rFonts w:ascii="Times New Roman" w:hAnsi="Times New Roman" w:cs="Times New Roman"/>
+        </w:rPr>
+        <w:t>aligned</w:t>
+      </w:r>
+      <w:r>
+        <w:rPr>
+          <w:rFonts w:ascii="Times New Roman" w:hAnsi="Times New Roman" w:cs="Times New Roman"/>
+        </w:rPr>
+        <w:t xml:space="preserve"> with </w:t>
+      </w:r>
+      <w:r>
+        <w:rPr>
+          <w:rFonts w:ascii="Times New Roman" w:hAnsi="Times New Roman" w:cs="Times New Roman"/>
+        </w:rPr>
+        <w:t xml:space="preserve">last semester’s documentation. With less than 6 weeks left of Senior Spring semester, our team moves forward with motivation to finalize features, add remaining components, and begin the </w:t>
+      </w:r>
+      <w:r>
+        <w:rPr>
+          <w:rFonts w:ascii="Times New Roman" w:hAnsi="Times New Roman" w:cs="Times New Roman"/>
+        </w:rPr>
+        <w:t>platform hosting process!</w:t>
       </w:r>
     </w:p>
     <w:p>
@@ -2809,6 +2981,12 @@
               </w:rPr>
               <w:t xml:space="preserve"> features</w:t>
             </w:r>
+            <w:r>
+              <w:rPr>
+                <w:rFonts w:ascii="Times New Roman" w:hAnsi="Times New Roman" w:cs="Times New Roman"/>
+              </w:rPr>
+              <w:t>, dashboard finalization</w:t>
+            </w:r>
           </w:p>
           <w:p>
             <w:pPr>
@@ -3090,7 +3268,6 @@
           <w:rFonts w:ascii="Times New Roman" w:hAnsi="Times New Roman" w:cs="Times New Roman"/>
         </w:rPr>
       </w:pPr>
-      <w:proofErr w:type="spellStart"/>
       <w:r>
         <w:rPr>
           <w:rFonts w:ascii="Times New Roman" w:hAnsi="Times New Roman" w:cs="Times New Roman"/>
@@ -3103,7 +3280,6 @@
         </w:rPr>
         <w:t>Weather</w:t>
       </w:r>
-      <w:proofErr w:type="spellEnd"/>
       <w:r>
         <w:rPr>
           <w:rFonts w:ascii="Times New Roman" w:hAnsi="Times New Roman" w:cs="Times New Roman"/>
@@ -3128,14 +3304,12 @@
         </w:rPr>
         <w:t xml:space="preserve">. </w:t>
       </w:r>
-      <w:proofErr w:type="spellStart"/>
       <w:r>
         <w:rPr>
           <w:rFonts w:ascii="Times New Roman" w:hAnsi="Times New Roman" w:cs="Times New Roman"/>
         </w:rPr>
         <w:t>OpenWeatherMap</w:t>
       </w:r>
-      <w:proofErr w:type="spellEnd"/>
       <w:r>
         <w:rPr>
           <w:rFonts w:ascii="Times New Roman" w:hAnsi="Times New Roman" w:cs="Times New Roman"/>

</xml_diff>